<commit_message>
Pass 2: build Week 3-5 decks (forked per module) and Zoom 2-5 decks; amend COM7411 brief wording; add check-allocation script
- Week 3 AM/PM, Week 4 AM/PM, Week 5 AM/PM decks forked into COM7401 On Campus / COM7411 Online
- Zoom 2-5 decks (campus only); legacy decks removed (history keeps them)
- COM7411 brief: check issued in Week 4 Saturday live session; narrative dates aligned to the submission table (Sat 28 Nov / Sat 5 Dec)
- Tools/allocate_checks.py: seeded, balanced allocation from a local roster

Co-Authored-By: Claude Sonnet 5.5 <noreply@anthropic.com>
Claude-Session: https://claude.ai/code/session_012ofQG9mjRGTuapUKfGwMWr
</commit_message>
<xml_diff>
--- a/26-27-B2-ModuleBox/0.2 Assessments&Moderation/COM7411_Assessment_Brief.docx
+++ b/26-27-B2-ModuleBox/0.2 Assessments&Moderation/COM7411_Assessment_Brief.docx
@@ -980,8 +980,7 @@
                 <w:sz w:val="22"/>
                 <w:szCs w:val="22"/>
               </w:rPr>
-              <w:lastRenderedPageBreak/>
-              <w:t>your own, unaided understanding of your research question and methodology under a time-limited challenge issued in the Week 4 Thursday Zoom session. Any evidence of scripted or GAI-assisted content in the recording will be treated as academic misconduct.</w:t>
+              <w:t>your own, unaided understanding of your research question and methodology under a time-limited challenge issued in the Week 4 Saturday live session. Any evidence of scripted or GAI-assisted content in the recording will be treated as academic misconduct.</w:t>
             </w:r>
           </w:p>
           <w:p>
@@ -1290,7 +1289,7 @@
           <w:sz w:val="22"/>
           <w:szCs w:val="22"/>
         </w:rPr>
-        <w:t>Friday 27 November 2026</w:t>
+        <w:t>Saturday 28 November 2026</w:t>
       </w:r>
       <w:r>
         <w:rPr>
@@ -1407,7 +1406,7 @@
           <w:sz w:val="22"/>
           <w:szCs w:val="22"/>
         </w:rPr>
-        <w:t>At the Week 4 Thursday Zoom session, you will be issued with one of four fixed methodological checks</w:t>
+        <w:t>In the Week 4 Saturday live session (with the same release on Moodle for anyone unable to attend), you will be issued with one of four fixed methodological checks</w:t>
       </w:r>
       <w:r>
         <w:rPr>
@@ -1615,7 +1614,7 @@
           <w:sz w:val="22"/>
           <w:szCs w:val="22"/>
         </w:rPr>
-        <w:t>Friday 4 December 2026</w:t>
+        <w:t>Saturday 5 December 2026</w:t>
       </w:r>
       <w:r>
         <w:rPr>

</xml_diff>